<commit_message>
Add unit tests for control-plane components without GStreamer
- Implement tests for the controller pipeline in `test_pipeline_controller.py`, covering layout parsing, pipeline description generation, and error handling.
- Create tests for the sender pipeline in `test_pipeline_sender.py`, focusing on pipeline shape, state transitions, and bitrate validation.
- Introduce tests for video port mappings in `test_video_ports.py`, ensuring correct port assignments for sender addresses.
- Add comprehensive tests for wiring between control-plane shells and pipelines in `test_video_wiring.py`, validating command handling and state management.
</commit_message>
<xml_diff>
--- a/ARC_Systems_Design.docx
+++ b/ARC_Systems_Design.docx
@@ -3028,7 +3028,7 @@
           <w:sz w:val="22"/>
           <w:szCs w:val="22"/>
         </w:rPr>
-        <w:t xml:space="preserve">Only one Sender transmits at a time. The Controller commands the previous Sender to stop before commanding the new Sender to start.</w:t>
+        <w:t xml:space="preserve">Up to two Senders may transmit concurrently — one per active compositor slot. The Controller commands a Sender to stop before commanding a different Sender to take its slot.</w:t>
       </w:r>
     </w:p>
     <w:p>
@@ -8491,7 +8491,7 @@
           <w:sz w:val="22"/>
           <w:szCs w:val="22"/>
         </w:rPr>
-        <w:t xml:space="preserve">Slot 0 (sink_0): Local camera (always live, never encoded/decoded)</w:t>
+        <w:t xml:space="preserve">Slot 0 (sink_0): Any source. Local camera is wired in directly (never encoded/decoded); any remote Sender is wired in via UDP/RTP → rtpjitterbuffer → rtph264depay → v4l2h264dec.</w:t>
       </w:r>
     </w:p>
     <w:p>
@@ -8510,7 +8510,7 @@
           <w:sz w:val="22"/>
           <w:szCs w:val="22"/>
         </w:rPr>
-        <w:t xml:space="preserve">Slot 1 (sink_1): Remote stream (UDP/RTP in → rtpjitterbuffer → rtph264depay → v4l2h264dec → compositor)</w:t>
+        <w:t xml:space="preserve">Slot 1 (sink_1): Any source. Same source options as slot 0. Either slot may also be empty (alpha=0) if a layout uses only one source.</w:t>
       </w:r>
     </w:p>
     <w:p>
@@ -8662,7 +8662,7 @@
                 <w:sz w:val="20"/>
                 <w:szCs w:val="20"/>
               </w:rPr>
-              <w:t xml:space="preserve">Slot 0 (local)</w:t>
+              <w:t xml:space="preserve">Slot 0</w:t>
             </w:r>
           </w:p>
         </w:tc>
@@ -8696,7 +8696,7 @@
                 <w:sz w:val="20"/>
                 <w:szCs w:val="20"/>
               </w:rPr>
-              <w:t xml:space="preserve">Slot 1 (remote)</w:t>
+              <w:t xml:space="preserve">Slot 1</w:t>
             </w:r>
           </w:p>
         </w:tc>
@@ -9235,7 +9235,7 @@
           <w:sz w:val="22"/>
           <w:szCs w:val="22"/>
         </w:rPr>
-        <w:t xml:space="preserve">Switching the active remote source involves the control plane:</w:t>
+        <w:t xml:space="preserve">Switching a slot's source involves the control plane (the local camera is the only source that does not require a control-plane handshake to start/stop):</w:t>
       </w:r>
     </w:p>
     <w:p>
@@ -9254,7 +9254,7 @@
           <w:sz w:val="22"/>
           <w:szCs w:val="22"/>
         </w:rPr>
-        <w:t xml:space="preserve">Controller sends STOP command to the current active Sender (VIDEO family)</w:t>
+        <w:t xml:space="preserve">Controller sends STOP_STREAM to the Sender being deactivated (VIDEO family). Skipped when the slot's current source is the local camera or is empty.</w:t>
       </w:r>
     </w:p>
     <w:p>
@@ -9273,7 +9273,7 @@
           <w:sz w:val="22"/>
           <w:szCs w:val="22"/>
         </w:rPr>
-        <w:t xml:space="preserve">Controller sends START command to the new Sender</w:t>
+        <w:t xml:space="preserve">Controller sends START_STREAM to the Sender being activated. Skipped when the new source is the local camera.</w:t>
       </w:r>
     </w:p>
     <w:p>

</xml_diff>

<commit_message>
Update README and scripts for Pi 5 and Zero 2 W compatibility
- Revised README.md to reflect changes in the Controller and Sender configurations, including updated video sink settings and layout options.
- Enhanced the setup script to ensure proper network configuration for Pi 5 and Zero 2 W, enforcing 2.4 GHz connections for reliability.
- Adjusted default video settings in the Controller and Sender configurations to optimize performance on the new hardware.
- Updated pipeline_sender.py to support configurable H.264 encoding, improving flexibility for different encoder setups.
- Added hardware notes in README.md to clarify setup requirements and configurations for the Raspberry Pi 5 and Zero 2 W.
</commit_message>
<xml_diff>
--- a/ARC_Systems_Design.docx
+++ b/ARC_Systems_Design.docx
@@ -1,5 +1,27 @@
 
-<file path=word/document.xml><?xml version="1.0" encoding="utf-8"?>
+<file path=docProps\app.xml><?xml version="1.0" encoding="utf-8"?>
+<Properties xmlns="http://schemas.openxmlformats.org/officeDocument/2006/extended-properties" xmlns:vt="http://schemas.openxmlformats.org/officeDocument/2006/docPropsVTypes"/>
+</file>
+
+<file path=docProps\core.xml><?xml version="1.0" encoding="utf-8"?>
+<cp:coreProperties xmlns:cp="http://schemas.openxmlformats.org/package/2006/metadata/core-properties" xmlns:dc="http://purl.org/dc/elements/1.1/" xmlns:dcterms="http://purl.org/dc/terms/" xmlns:dcmitype="http://purl.org/dc/dcmitype/" xmlns:xsi="http://www.w3.org/2001/XMLSchema-instance">
+  <dc:creator>Un-named</dc:creator>
+  <cp:lastModifiedBy>Un-named</cp:lastModifiedBy>
+  <cp:revision>1</cp:revision>
+  <dcterms:created xsi:type="dcterms:W3CDTF">2026-05-08T23:11:38.694Z</dcterms:created>
+  <dcterms:modified xsi:type="dcterms:W3CDTF">2026-05-08T23:11:38.695Z</dcterms:modified>
+</cp:coreProperties>
+</file>
+
+<file path=docProps\custom.xml><?xml version="1.0" encoding="utf-8"?>
+<Properties xmlns="http://schemas.openxmlformats.org/officeDocument/2006/custom-properties" xmlns:vt="http://schemas.openxmlformats.org/officeDocument/2006/docPropsVTypes"/>
+</file>
+
+<file path=word\comments.xml><?xml version="1.0" encoding="utf-8"?>
+<w:comments xmlns:cx="http://schemas.microsoft.com/office/drawing/2014/chartex" xmlns:cx1="http://schemas.microsoft.com/office/drawing/2015/9/8/chartex" xmlns:cx2="http://schemas.microsoft.com/office/drawing/2015/10/21/chartex" xmlns:cx3="http://schemas.microsoft.com/office/drawing/2016/5/9/chartex" xmlns:cx4="http://schemas.microsoft.com/office/drawing/2016/5/10/chartex" xmlns:cx5="http://schemas.microsoft.com/office/drawing/2016/5/11/chartex" xmlns:cx6="http://schemas.microsoft.com/office/drawing/2016/5/12/chartex" xmlns:cx7="http://schemas.microsoft.com/office/drawing/2016/5/13/chartex" xmlns:cx8="http://schemas.microsoft.com/office/drawing/2016/5/14/chartex" xmlns:mc="http://schemas.openxmlformats.org/markup-compatibility/2006" xmlns:aink="http://schemas.microsoft.com/office/drawing/2016/ink" xmlns:am3d="http://schemas.microsoft.com/office/drawing/2017/model3d" xmlns:o="urn:schemas-microsoft-com:office:office" xmlns:r="http://schemas.openxmlformats.org/officeDocument/2006/relationships" xmlns:m="http://schemas.openxmlformats.org/officeDocument/2006/math" xmlns:v="urn:schemas-microsoft-com:vml" xmlns:wp14="http://schemas.microsoft.com/office/word/2010/wordprocessingDrawing" xmlns:wp="http://schemas.openxmlformats.org/drawingml/2006/wordprocessingDrawing" xmlns:w10="urn:schemas-microsoft-com:office:word" xmlns:w="http://schemas.openxmlformats.org/wordprocessingml/2006/main" xmlns:w14="http://schemas.microsoft.com/office/word/2010/wordml" xmlns:w15="http://schemas.microsoft.com/office/word/2012/wordml" xmlns:w16cex="http://schemas.microsoft.com/office/word/2018/wordml/cex" xmlns:w16cid="http://schemas.microsoft.com/office/word/2016/wordml/cid" xmlns:w16="http://schemas.microsoft.com/office/word/2018/wordml" xmlns:w16sdtdh="http://schemas.microsoft.com/office/word/2020/wordml/sdtdatahash" xmlns:w16se="http://schemas.microsoft.com/office/word/2015/wordml/symex" xmlns:wpg="http://schemas.microsoft.com/office/word/2010/wordprocessingGroup" xmlns:wpi="http://schemas.microsoft.com/office/word/2010/wordprocessingInk" xmlns:wne="http://schemas.microsoft.com/office/word/2006/wordml" xmlns:wps="http://schemas.microsoft.com/office/word/2010/wordprocessingShape"/>
+</file>
+
+<file path=word\document.xml><?xml version="1.0" encoding="utf-8"?>
 <w:document xmlns:wpc="http://schemas.microsoft.com/office/word/2010/wordprocessingCanvas" xmlns:mc="http://schemas.openxmlformats.org/markup-compatibility/2006" xmlns:o="urn:schemas-microsoft-com:office:office" xmlns:r="http://schemas.openxmlformats.org/officeDocument/2006/relationships" xmlns:m="http://schemas.openxmlformats.org/officeDocument/2006/math" xmlns:v="urn:schemas-microsoft-com:vml" xmlns:wp14="http://schemas.microsoft.com/office/word/2010/wordprocessingDrawing" xmlns:wp="http://schemas.openxmlformats.org/drawingml/2006/wordprocessingDrawing" xmlns:w10="urn:schemas-microsoft-com:office:word" xmlns:w="http://schemas.openxmlformats.org/wordprocessingml/2006/main" xmlns:w14="http://schemas.microsoft.com/office/word/2010/wordml" xmlns:w15="http://schemas.microsoft.com/office/word/2012/wordml" xmlns:wpg="http://schemas.microsoft.com/office/word/2010/wordprocessingGroup" xmlns:wpi="http://schemas.microsoft.com/office/word/2010/wordprocessingInk" xmlns:wne="http://schemas.microsoft.com/office/word/2006/wordml" xmlns:wps="http://schemas.microsoft.com/office/word/2010/wordprocessingShape" xmlns:cx="http://schemas.microsoft.com/office/drawing/2014/chartex" xmlns:cx1="http://schemas.microsoft.com/office/drawing/2015/9/8/chartex" xmlns:cx2="http://schemas.microsoft.com/office/drawing/2015/10/21/chartex" xmlns:cx3="http://schemas.microsoft.com/office/drawing/2016/5/9/chartex" xmlns:cx4="http://schemas.microsoft.com/office/drawing/2016/5/10/chartex" xmlns:cx5="http://schemas.microsoft.com/office/drawing/2016/5/11/chartex" xmlns:cx6="http://schemas.microsoft.com/office/drawing/2016/5/12/chartex" xmlns:cx7="http://schemas.microsoft.com/office/drawing/2016/5/13/chartex" xmlns:cx8="http://schemas.microsoft.com/office/drawing/2016/5/14/chartex" xmlns:aink="http://schemas.microsoft.com/office/drawing/2016/ink" xmlns:am3d="http://schemas.microsoft.com/office/drawing/2017/model3d" xmlns:w16cex="http://schemas.microsoft.com/office/word/2018/wordml/cex" xmlns:w16cid="http://schemas.microsoft.com/office/word/2016/wordml/cid" xmlns:w16="http://schemas.microsoft.com/office/word/2018/wordml" xmlns:w16sdtdh="http://schemas.microsoft.com/office/word/2020/wordml/sdtdatahash" xmlns:w16se="http://schemas.microsoft.com/office/word/2015/wordml/symex" mc:Ignorable="w14 w15 wp14">
   <w:body>
     <w:p>
@@ -65,7 +87,7 @@
           <w:sz w:val="20"/>
           <w:szCs w:val="20"/>
         </w:rPr>
-        <w:t xml:space="preserve">Version 1.0  —  KD3BBP / TRT ARC Project</w:t>
+        <w:t xml:space="preserve">Version 1.0  â€”  KD3BBP / TRT ARC Project</w:t>
       </w:r>
     </w:p>
     <w:p>
@@ -148,7 +170,8 @@
         <w:spacing w:after="60" w:before="0"/>
       </w:pPr>
       <w:r>
-        <w:t xml:space="preserve"/>
+        <w:t xml:space="preserve">
+        </w:t>
       </w:r>
     </w:p>
     <w:tbl>
@@ -206,7 +229,8 @@
         <w:spacing w:after="60" w:before="0"/>
       </w:pPr>
       <w:r>
-        <w:t xml:space="preserve"/>
+        <w:t xml:space="preserve">
+        </w:t>
       </w:r>
     </w:p>
     <w:p>
@@ -419,7 +443,8 @@
         <w:spacing w:after="60" w:before="0"/>
       </w:pPr>
       <w:r>
-        <w:t xml:space="preserve"/>
+        <w:t xml:space="preserve">
+        </w:t>
       </w:r>
     </w:p>
     <w:p>
@@ -455,7 +480,7 @@
           <w:sz w:val="22"/>
           <w:szCs w:val="22"/>
         </w:rPr>
-        <w:t xml:space="preserve">Hardware: Raspberry Pi Zero 2 W on all nodes (2.4 GHz wifi only, single-core equivalent performance)</w:t>
+        <w:t xml:space="preserve">Hardware: Raspberry Pi 5 is the current Controller baseline for live compositing and NTSC composite output. Raspberry Pi Zero 2 W remains acceptable for Sender nodes. Earlier all-Zero-2-W assumptions are superseded by the bench baseline in section 12.6.</w:t>
       </w:r>
     </w:p>
     <w:p>
@@ -558,7 +583,8 @@
         <w:spacing w:after="60" w:before="0"/>
       </w:pPr>
       <w:r>
-        <w:t xml:space="preserve"/>
+        <w:t xml:space="preserve">
+        </w:t>
       </w:r>
     </w:p>
     <w:p>
@@ -614,7 +640,8 @@
         <w:spacing w:after="60" w:before="0"/>
       </w:pPr>
       <w:r>
-        <w:t xml:space="preserve"/>
+        <w:t xml:space="preserve">
+        </w:t>
       </w:r>
     </w:p>
     <w:tbl>
@@ -1369,7 +1396,7 @@
                 <w:sz w:val="20"/>
                 <w:szCs w:val="20"/>
               </w:rPr>
-              <w:t xml:space="preserve">—</w:t>
+              <w:t xml:space="preserve">â€”</w:t>
             </w:r>
           </w:p>
         </w:tc>
@@ -1442,7 +1469,8 @@
         <w:spacing w:after="60" w:before="0"/>
       </w:pPr>
       <w:r>
-        <w:t xml:space="preserve"/>
+        <w:t xml:space="preserve">
+        </w:t>
       </w:r>
     </w:p>
     <w:p>
@@ -1646,7 +1674,7 @@
                 <w:sz w:val="20"/>
                 <w:szCs w:val="20"/>
               </w:rPr>
-              <w:t xml:space="preserve">FC-N ↔ Controller</w:t>
+              <w:t xml:space="preserve">FC-N â†” Controller</w:t>
             </w:r>
           </w:p>
         </w:tc>
@@ -1772,7 +1800,7 @@
                 <w:sz w:val="20"/>
                 <w:szCs w:val="20"/>
               </w:rPr>
-              <w:t xml:space="preserve">FC-N ↔ Radio</w:t>
+              <w:t xml:space="preserve">FC-N â†” Radio</w:t>
             </w:r>
           </w:p>
         </w:tc>
@@ -1898,7 +1926,7 @@
                 <w:sz w:val="20"/>
                 <w:szCs w:val="20"/>
               </w:rPr>
-              <w:t xml:space="preserve">FC-C ↔ Sender-C</w:t>
+              <w:t xml:space="preserve">FC-C â†” Sender-C</w:t>
             </w:r>
           </w:p>
         </w:tc>
@@ -2024,7 +2052,7 @@
                 <w:sz w:val="20"/>
                 <w:szCs w:val="20"/>
               </w:rPr>
-              <w:t xml:space="preserve">FC-L ↔ Sender-L1</w:t>
+              <w:t xml:space="preserve">FC-L â†” Sender-L1</w:t>
             </w:r>
           </w:p>
         </w:tc>
@@ -2150,7 +2178,7 @@
                 <w:sz w:val="20"/>
                 <w:szCs w:val="20"/>
               </w:rPr>
-              <w:t xml:space="preserve">Senders ↔ Controller</w:t>
+              <w:t xml:space="preserve">Senders â†” Controller</w:t>
             </w:r>
           </w:p>
         </w:tc>
@@ -2276,7 +2304,7 @@
                 <w:sz w:val="20"/>
                 <w:szCs w:val="20"/>
               </w:rPr>
-              <w:t xml:space="preserve">Senders → Controller</w:t>
+              <w:t xml:space="preserve">Senders â†’ Controller</w:t>
             </w:r>
           </w:p>
         </w:tc>
@@ -2380,7 +2408,8 @@
         <w:spacing w:after="60" w:before="0"/>
       </w:pPr>
       <w:r>
-        <w:t xml:space="preserve"/>
+        <w:t xml:space="preserve">
+        </w:t>
       </w:r>
     </w:p>
     <w:tbl>
@@ -2440,7 +2469,8 @@
         <w:spacing w:after="60" w:before="0"/>
       </w:pPr>
       <w:r>
-        <w:t xml:space="preserve"/>
+        <w:t xml:space="preserve">
+        </w:t>
       </w:r>
     </w:p>
     <w:p>
@@ -2586,7 +2616,8 @@
         <w:spacing w:after="60" w:before="0"/>
       </w:pPr>
       <w:r>
-        <w:t xml:space="preserve"/>
+        <w:t xml:space="preserve">
+        </w:t>
       </w:r>
     </w:p>
     <w:p>
@@ -2636,7 +2667,7 @@
           <w:sz w:val="22"/>
           <w:szCs w:val="22"/>
         </w:rPr>
-        <w:t xml:space="preserve">Video subsystem: Captures from CSI camera, encodes H.264 in hardware (v4l2h264enc), streams over UDP/RTP to the Controller on port 5000. Also records locally to /var/arc/recordings/ for post-flight recovery. Recording and transmission are independently start/stoppable.</w:t>
+        <w:t xml:space="preserve">Video subsystem: Captures from CSI camera, encodes H.264, streams over UDP/RTP to the Controller on deterministic port 50XX where XX is the Sender address, and can record locally to /var/arc/recordings/ for post-flight recovery. On the current Zero 2 W sender baseline, live transmission uses software x264enc because bcm2835/v4l2h264enc is failing on the tested Pi OS kernel.</w:t>
       </w:r>
     </w:p>
     <w:p>
@@ -2677,7 +2708,8 @@
         <w:spacing w:after="60" w:before="0"/>
       </w:pPr>
       <w:r>
-        <w:t xml:space="preserve"/>
+        <w:t xml:space="preserve">
+        </w:t>
       </w:r>
     </w:p>
     <w:p>
@@ -2792,7 +2824,8 @@
         <w:spacing w:after="60" w:before="0"/>
       </w:pPr>
       <w:r>
-        <w:t xml:space="preserve"/>
+        <w:t xml:space="preserve">
+        </w:t>
       </w:r>
     </w:p>
     <w:tbl>
@@ -2852,7 +2885,8 @@
         <w:spacing w:after="60" w:before="0"/>
       </w:pPr>
       <w:r>
-        <w:t xml:space="preserve"/>
+        <w:t xml:space="preserve">
+        </w:t>
       </w:r>
     </w:p>
     <w:p>
@@ -2933,7 +2967,7 @@
           <w:sz w:val="22"/>
           <w:szCs w:val="22"/>
         </w:rPr>
-        <w:t xml:space="preserve">Codec: H.264, Baseline profile, hardware-encoded on sender (v4l2h264enc), hardware-decoded on controller (v4l2h264dec)</w:t>
+        <w:t xml:space="preserve">Codec: H.264 over RTP/UDP. Current baseline is software x264enc on Zero 2 W senders and avdec_h264 on the Pi 5 controller. Hardware encode/decode may be re-enabled later only after validating the target OS/kernel.</w:t>
       </w:r>
     </w:p>
     <w:p>
@@ -3028,7 +3062,7 @@
           <w:sz w:val="22"/>
           <w:szCs w:val="22"/>
         </w:rPr>
-        <w:t xml:space="preserve">Up to two Senders may transmit concurrently — one per active compositor slot. The Controller commands a Sender to stop before commanding a different Sender to take its slot.</w:t>
+        <w:t xml:space="preserve">Up to two Senders may transmit concurrently â€” one per active compositor slot. The Controller commands a Sender to stop before commanding a different Sender to take its slot.</w:t>
       </w:r>
     </w:p>
     <w:p>
@@ -3036,7 +3070,8 @@
         <w:spacing w:after="60" w:before="0"/>
       </w:pPr>
       <w:r>
-        <w:t xml:space="preserve"/>
+        <w:t xml:space="preserve">
+        </w:t>
       </w:r>
     </w:p>
     <w:p>
@@ -3151,7 +3186,8 @@
         <w:spacing w:after="60" w:before="0"/>
       </w:pPr>
       <w:r>
-        <w:t xml:space="preserve"/>
+        <w:t xml:space="preserve">
+        </w:t>
       </w:r>
     </w:p>
     <w:p>
@@ -4232,7 +4268,8 @@
         <w:spacing w:after="60" w:before="0"/>
       </w:pPr>
       <w:r>
-        <w:t xml:space="preserve"/>
+        <w:t xml:space="preserve">
+        </w:t>
       </w:r>
     </w:p>
     <w:p>
@@ -4271,7 +4308,8 @@
         <w:spacing w:after="60" w:before="0"/>
       </w:pPr>
       <w:r>
-        <w:t xml:space="preserve"/>
+        <w:t xml:space="preserve">
+        </w:t>
       </w:r>
     </w:p>
     <w:tbl>
@@ -5214,7 +5252,7 @@
                 <w:sz w:val="20"/>
                 <w:szCs w:val="20"/>
               </w:rPr>
-              <w:t xml:space="preserve">0–241 bytes</w:t>
+              <w:t xml:space="preserve">0â€“241 bytes</w:t>
             </w:r>
           </w:p>
         </w:tc>
@@ -5351,7 +5389,8 @@
         <w:spacing w:after="60" w:before="0"/>
       </w:pPr>
       <w:r>
-        <w:t xml:space="preserve"/>
+        <w:t xml:space="preserve">
+        </w:t>
       </w:r>
     </w:p>
     <w:p>
@@ -5373,7 +5412,8 @@
         <w:spacing w:after="60" w:before="0"/>
       </w:pPr>
       <w:r>
-        <w:t xml:space="preserve"/>
+        <w:t xml:space="preserve">
+        </w:t>
       </w:r>
     </w:p>
     <w:p>
@@ -5604,7 +5644,7 @@
                 <w:sz w:val="20"/>
                 <w:szCs w:val="20"/>
               </w:rPr>
-              <w:t xml:space="preserve">—</w:t>
+              <w:t xml:space="preserve">â€”</w:t>
             </w:r>
           </w:p>
         </w:tc>
@@ -6649,7 +6689,7 @@
                 <w:sz w:val="20"/>
                 <w:szCs w:val="20"/>
               </w:rPr>
-              <w:t xml:space="preserve">—</w:t>
+              <w:t xml:space="preserve">â€”</w:t>
             </w:r>
           </w:p>
         </w:tc>
@@ -6660,7 +6700,8 @@
         <w:spacing w:after="60" w:before="0"/>
       </w:pPr>
       <w:r>
-        <w:t xml:space="preserve"/>
+        <w:t xml:space="preserve">
+        </w:t>
       </w:r>
     </w:p>
     <w:p>
@@ -7346,7 +7387,8 @@
         <w:spacing w:after="60" w:before="0"/>
       </w:pPr>
       <w:r>
-        <w:t xml:space="preserve"/>
+        <w:t xml:space="preserve">
+        </w:t>
       </w:r>
     </w:p>
     <w:p>
@@ -7434,7 +7476,7 @@
           <w:sz w:val="22"/>
           <w:szCs w:val="22"/>
         </w:rPr>
-        <w:t xml:space="preserve">Payloads may contain any byte value including 0x00 — COBS handles it transparently</w:t>
+        <w:t xml:space="preserve">Payloads may contain any byte value including 0x00 â€” COBS handles it transparently</w:t>
       </w:r>
     </w:p>
     <w:p>
@@ -7442,7 +7484,8 @@
         <w:spacing w:after="60" w:before="0"/>
       </w:pPr>
       <w:r>
-        <w:t xml:space="preserve"/>
+        <w:t xml:space="preserve">
+        </w:t>
       </w:r>
     </w:p>
     <w:p>
@@ -7464,7 +7507,8 @@
         <w:spacing w:after="60" w:before="0"/>
       </w:pPr>
       <w:r>
-        <w:t xml:space="preserve"/>
+        <w:t xml:space="preserve">
+        </w:t>
       </w:r>
     </w:p>
     <w:p>
@@ -7541,7 +7585,8 @@
         <w:spacing w:after="60" w:before="0"/>
       </w:pPr>
       <w:r>
-        <w:t xml:space="preserve"/>
+        <w:t xml:space="preserve">
+        </w:t>
       </w:r>
     </w:p>
     <w:p>
@@ -7591,7 +7636,8 @@
         <w:spacing w:after="60" w:before="0"/>
       </w:pPr>
       <w:r>
-        <w:t xml:space="preserve"/>
+        <w:t xml:space="preserve">
+        </w:t>
       </w:r>
     </w:p>
     <w:p>
@@ -7668,7 +7714,8 @@
         <w:spacing w:after="60" w:before="0"/>
       </w:pPr>
       <w:r>
-        <w:t xml:space="preserve"/>
+        <w:t xml:space="preserve">
+        </w:t>
       </w:r>
     </w:p>
     <w:p>
@@ -7690,7 +7737,8 @@
         <w:spacing w:after="60" w:before="0"/>
       </w:pPr>
       <w:r>
-        <w:t xml:space="preserve"/>
+        <w:t xml:space="preserve">
+        </w:t>
       </w:r>
     </w:p>
     <w:tbl>
@@ -7838,7 +7886,7 @@
                 <w:sz w:val="20"/>
                 <w:szCs w:val="20"/>
               </w:rPr>
-              <w:t xml:space="preserve">FC-N → UART | FC-C → TCP to Sender-C | FC-L → TCP to Sender-L1 | Ground → UART to FC-N | Senders → their own TCP channel</w:t>
+              <w:t xml:space="preserve">FC-N â†’ UART | FC-C â†’ TCP to Sender-C | FC-L â†’ TCP to Sender-L1 | Ground â†’ UART to FC-N | Senders â†’ their own TCP channel</w:t>
             </w:r>
           </w:p>
         </w:tc>
@@ -7902,7 +7950,7 @@
                 <w:sz w:val="20"/>
                 <w:szCs w:val="20"/>
               </w:rPr>
-              <w:t xml:space="preserve">FC-C → UART | Everything else → TCP to Controller</w:t>
+              <w:t xml:space="preserve">FC-C â†’ UART | Everything else â†’ TCP to Controller</w:t>
             </w:r>
           </w:p>
         </w:tc>
@@ -7966,7 +8014,7 @@
                 <w:sz w:val="20"/>
                 <w:szCs w:val="20"/>
               </w:rPr>
-              <w:t xml:space="preserve">FC-L → UART | Everything else → TCP to Controller</w:t>
+              <w:t xml:space="preserve">FC-L â†’ UART | Everything else â†’ TCP to Controller</w:t>
             </w:r>
           </w:p>
         </w:tc>
@@ -8030,7 +8078,7 @@
                 <w:sz w:val="20"/>
                 <w:szCs w:val="20"/>
               </w:rPr>
-              <w:t xml:space="preserve">No UART. All traffic → TCP to Controller</w:t>
+              <w:t xml:space="preserve">No UART. All traffic â†’ TCP to Controller</w:t>
             </w:r>
           </w:p>
         </w:tc>
@@ -8094,7 +8142,7 @@
                 <w:sz w:val="20"/>
                 <w:szCs w:val="20"/>
               </w:rPr>
-              <w:t xml:space="preserve">Controller → UART | Everything else → UART to radio (ground)</w:t>
+              <w:t xml:space="preserve">Controller â†’ UART | Everything else â†’ UART to radio (ground)</w:t>
             </w:r>
           </w:p>
         </w:tc>
@@ -8158,7 +8206,7 @@
                 <w:sz w:val="20"/>
                 <w:szCs w:val="20"/>
               </w:rPr>
-              <w:t xml:space="preserve">My Sender → UART | Everything else → UART to Sender</w:t>
+              <w:t xml:space="preserve">My Sender â†’ UART | Everything else â†’ UART to Sender</w:t>
             </w:r>
           </w:p>
         </w:tc>
@@ -8169,7 +8217,8 @@
         <w:spacing w:after="60" w:before="0"/>
       </w:pPr>
       <w:r>
-        <w:t xml:space="preserve"/>
+        <w:t xml:space="preserve">
+        </w:t>
       </w:r>
     </w:p>
     <w:p>
@@ -8225,7 +8274,8 @@
         <w:spacing w:after="60" w:before="0"/>
       </w:pPr>
       <w:r>
-        <w:t xml:space="preserve"/>
+        <w:t xml:space="preserve">
+        </w:t>
       </w:r>
     </w:p>
     <w:p>
@@ -8275,7 +8325,7 @@
           <w:sz w:val="22"/>
           <w:szCs w:val="22"/>
         </w:rPr>
-        <w:t xml:space="preserve">Transmission branch: libcamerasrc → v4l2h264enc → rtph264pay → udpsink (to Controller port 5000)</w:t>
+        <w:t xml:space="preserve">Transmission branch: libcamerasrc -&gt; videoconvert -&gt; x264enc tune=zerolatency speed-preset=ultrafast key-int-max=15 bitrate=1200 -&gt; h264parse -&gt; rtph264pay -&gt; udpsink (to Controller port 50XX, where XX is the Sender address).</w:t>
       </w:r>
     </w:p>
     <w:p>
@@ -8294,7 +8344,7 @@
           <w:sz w:val="22"/>
           <w:szCs w:val="22"/>
         </w:rPr>
-        <w:t xml:space="preserve">Recording branch: libcamerasrc → v4l2h264enc → mp4mux → filesink (/var/arc/recordings/)</w:t>
+        <w:t xml:space="preserve">Recording branch: libcamerasrc â†’ v4l2h264enc â†’ mp4mux â†’ filesink (/var/arc/recordings/)</w:t>
       </w:r>
     </w:p>
     <w:p>
@@ -8302,7 +8352,8 @@
         <w:spacing w:after="60" w:before="0"/>
       </w:pPr>
       <w:r>
-        <w:t xml:space="preserve"/>
+        <w:t xml:space="preserve">
+        </w:t>
       </w:r>
     </w:p>
     <w:p>
@@ -8316,7 +8367,7 @@
           <w:sz w:val="22"/>
           <w:szCs w:val="22"/>
         </w:rPr>
-        <w:t xml:space="preserve">Both branches use the hardware H.264 encoder (VideoCore IV). Recording and transmission are independently stoppable:</w:t>
+        <w:t xml:space="preserve">The live branch currently uses software x264enc at 640x480@15fps, about 1.2 Mbps. Hardware v4l2h264enc is left as a configurable option, not the default, because the tested Zero 2 W kernel reports bcm2835-codec stream-start failures.</w:t>
       </w:r>
     </w:p>
     <w:p>
@@ -8381,7 +8432,8 @@
         <w:spacing w:after="60" w:before="0"/>
       </w:pPr>
       <w:r>
-        <w:t xml:space="preserve"/>
+        <w:t xml:space="preserve">
+        </w:t>
       </w:r>
     </w:p>
     <w:tbl>
@@ -8441,7 +8493,8 @@
         <w:spacing w:after="60" w:before="0"/>
       </w:pPr>
       <w:r>
-        <w:t xml:space="preserve"/>
+        <w:t xml:space="preserve">
+        </w:t>
       </w:r>
     </w:p>
     <w:p>
@@ -8491,7 +8544,7 @@
           <w:sz w:val="22"/>
           <w:szCs w:val="22"/>
         </w:rPr>
-        <w:t xml:space="preserve">Slot 0 (sink_0): Any source. Local camera is wired in directly (never encoded/decoded); any remote Sender is wired in via UDP/RTP → rtpjitterbuffer → rtph264depay → v4l2h264dec.</w:t>
+        <w:t xml:space="preserve">Slot 0 / local camera: wired directly into the compositor as raw I420 video. On Pi 5 the local camera path must negotiate after videoconvert to 640x480 I420 at 30fps, then pass through a small leaky queue.</w:t>
       </w:r>
     </w:p>
     <w:p>
@@ -8546,7 +8599,8 @@
         <w:spacing w:after="60" w:before="0"/>
       </w:pPr>
       <w:r>
-        <w:t xml:space="preserve"/>
+        <w:t xml:space="preserve">
+        </w:t>
       </w:r>
     </w:p>
     <w:p>
@@ -9182,7 +9236,8 @@
         <w:spacing w:after="60" w:before="0"/>
       </w:pPr>
       <w:r>
-        <w:t xml:space="preserve"/>
+        <w:t xml:space="preserve">
+        </w:t>
       </w:r>
     </w:p>
     <w:p>
@@ -9204,7 +9259,8 @@
         <w:spacing w:after="60" w:before="0"/>
       </w:pPr>
       <w:r>
-        <w:t xml:space="preserve"/>
+        <w:t xml:space="preserve">
+        </w:t>
       </w:r>
     </w:p>
     <w:p>
@@ -9292,7 +9348,7 @@
           <w:sz w:val="22"/>
           <w:szCs w:val="22"/>
         </w:rPr>
-        <w:t xml:space="preserve">New Sender begins streaming to Controller port 5000</w:t>
+        <w:t xml:space="preserve">New Sender begins streaming to its deterministic Controller UDP port: 50XX where XX is the Sender address, for example Sender-C 0x12 streams to UDP port 5012.</w:t>
       </w:r>
     </w:p>
     <w:p>
@@ -9319,7 +9375,8 @@
         <w:spacing w:after="60" w:before="0"/>
       </w:pPr>
       <w:r>
-        <w:t xml:space="preserve"/>
+        <w:t xml:space="preserve">
+        </w:t>
       </w:r>
     </w:p>
     <w:p>
@@ -9333,7 +9390,7 @@
           <w:sz w:val="22"/>
           <w:szCs w:val="22"/>
         </w:rPr>
-        <w:t xml:space="preserve">Swap latency budget: ~20ms (TCP round-trip x2) + ~200ms (Sender pipeline spin-up) + ~50ms (first keyframe + jitter buffer). Total approximately 300–500ms. This is acceptable for manual or flight-stage-triggered switching.</w:t>
+        <w:t xml:space="preserve">Swap latency budget: ~20ms (TCP round-trip x2) + ~200ms (Sender pipeline spin-up) + ~50ms (first keyframe + jitter buffer). Total approximately 300â€“500ms. This is acceptable for manual or flight-stage-triggered switching.</w:t>
       </w:r>
     </w:p>
     <w:p>
@@ -9341,7 +9398,8 @@
         <w:spacing w:after="60" w:before="0"/>
       </w:pPr>
       <w:r>
-        <w:t xml:space="preserve"/>
+        <w:t xml:space="preserve">
+        </w:t>
       </w:r>
     </w:p>
     <w:p>
@@ -9363,7 +9421,8 @@
         <w:spacing w:after="60" w:before="0"/>
       </w:pPr>
       <w:r>
-        <w:t xml:space="preserve"/>
+        <w:t xml:space="preserve">
+        </w:t>
       </w:r>
     </w:p>
     <w:p>
@@ -9681,7 +9740,7 @@
                 <w:sz w:val="20"/>
                 <w:szCs w:val="20"/>
               </w:rPr>
-              <w:t xml:space="preserve">Any → Any</w:t>
+              <w:t xml:space="preserve">Any â†’ Any</w:t>
             </w:r>
           </w:p>
         </w:tc>
@@ -9838,7 +9897,7 @@
                 <w:sz w:val="20"/>
                 <w:szCs w:val="20"/>
               </w:rPr>
-              <w:t xml:space="preserve">Receiver → Sender</w:t>
+              <w:t xml:space="preserve">Receiver â†’ Sender</w:t>
             </w:r>
           </w:p>
         </w:tc>
@@ -9995,7 +10054,7 @@
                 <w:sz w:val="20"/>
                 <w:szCs w:val="20"/>
               </w:rPr>
-              <w:t xml:space="preserve">Any → Any</w:t>
+              <w:t xml:space="preserve">Any â†’ Any</w:t>
             </w:r>
           </w:p>
         </w:tc>
@@ -10068,7 +10127,8 @@
         <w:spacing w:after="60" w:before="0"/>
       </w:pPr>
       <w:r>
-        <w:t xml:space="preserve"/>
+        <w:t xml:space="preserve">
+        </w:t>
       </w:r>
     </w:p>
     <w:p>
@@ -10085,7 +10145,7 @@
           <w:sz w:val="26"/>
           <w:szCs w:val="26"/>
         </w:rPr>
-        <w:t xml:space="preserve">8.2 FC_VIDEO Family (0x03) — FC to Controller</w:t>
+        <w:t xml:space="preserve">8.2 FC_VIDEO Family (0x03) â€” FC to Controller</w:t>
       </w:r>
     </w:p>
     <w:tbl>
@@ -10754,7 +10814,8 @@
         <w:spacing w:after="60" w:before="0"/>
       </w:pPr>
       <w:r>
-        <w:t xml:space="preserve"/>
+        <w:t xml:space="preserve">
+        </w:t>
       </w:r>
     </w:p>
     <w:p>
@@ -10771,7 +10832,7 @@
           <w:sz w:val="26"/>
           <w:szCs w:val="26"/>
         </w:rPr>
-        <w:t xml:space="preserve">8.3 VIDEO Family (0x02) — Controller to Sender</w:t>
+        <w:t xml:space="preserve">8.3 VIDEO Family (0x02) â€” Controller to Sender</w:t>
       </w:r>
     </w:p>
     <w:tbl>
@@ -11566,7 +11627,8 @@
         <w:spacing w:after="60" w:before="0"/>
       </w:pPr>
       <w:r>
-        <w:t xml:space="preserve"/>
+        <w:t xml:space="preserve">
+        </w:t>
       </w:r>
     </w:p>
     <w:p>
@@ -11580,7 +11642,7 @@
           <w:sz w:val="22"/>
           <w:szCs w:val="22"/>
         </w:rPr>
-        <w:t xml:space="preserve">STATUS_REPORT payload fields (Sender → Controller, 1 Hz):</w:t>
+        <w:t xml:space="preserve">STATUS_REPORT payload fields (Sender â†’ Controller, 1 Hz):</w:t>
       </w:r>
     </w:p>
     <w:p>
@@ -11637,7 +11699,7 @@
           <w:sz w:val="22"/>
           <w:szCs w:val="22"/>
         </w:rPr>
-        <w:t xml:space="preserve">CPU load (1 byte): 0–100 percent</w:t>
+        <w:t xml:space="preserve">CPU load (1 byte): 0â€“100 percent</w:t>
       </w:r>
     </w:p>
     <w:p>
@@ -11721,7 +11783,8 @@
         <w:spacing w:after="60" w:before="0"/>
       </w:pPr>
       <w:r>
-        <w:t xml:space="preserve"/>
+        <w:t xml:space="preserve">
+        </w:t>
       </w:r>
     </w:p>
     <w:p>
@@ -11738,7 +11801,7 @@
           <w:sz w:val="26"/>
           <w:szCs w:val="26"/>
         </w:rPr>
-        <w:t xml:space="preserve">8.4 FC_COORD Family (0x01) — FC to FC</w:t>
+        <w:t xml:space="preserve">8.4 FC_COORD Family (0x01) â€” FC to FC</w:t>
       </w:r>
     </w:p>
     <w:p>
@@ -11836,7 +11899,8 @@
         <w:spacing w:after="60" w:before="0"/>
       </w:pPr>
       <w:r>
-        <w:t xml:space="preserve"/>
+        <w:t xml:space="preserve">
+        </w:t>
       </w:r>
     </w:p>
     <w:p>
@@ -12619,7 +12683,8 @@
         <w:spacing w:after="60" w:before="0"/>
       </w:pPr>
       <w:r>
-        <w:t xml:space="preserve"/>
+        <w:t xml:space="preserve">
+        </w:t>
       </w:r>
     </w:p>
     <w:p>
@@ -13193,7 +13258,8 @@
         <w:spacing w:after="60" w:before="0"/>
       </w:pPr>
       <w:r>
-        <w:t xml:space="preserve"/>
+        <w:t xml:space="preserve">
+        </w:t>
       </w:r>
     </w:p>
     <w:p>
@@ -13289,7 +13355,8 @@
         <w:spacing w:after="60" w:before="0"/>
       </w:pPr>
       <w:r>
-        <w:t xml:space="preserve"/>
+        <w:t xml:space="preserve">
+        </w:t>
       </w:r>
     </w:p>
     <w:p>
@@ -13311,7 +13378,8 @@
         <w:spacing w:after="60" w:before="0"/>
       </w:pPr>
       <w:r>
-        <w:t xml:space="preserve"/>
+        <w:t xml:space="preserve">
+        </w:t>
       </w:r>
     </w:p>
     <w:p>
@@ -13426,7 +13494,8 @@
         <w:spacing w:after="60" w:before="0"/>
       </w:pPr>
       <w:r>
-        <w:t xml:space="preserve"/>
+        <w:t xml:space="preserve">
+        </w:t>
       </w:r>
     </w:p>
     <w:p>
@@ -13505,7 +13574,8 @@
           <w:sz w:val="18"/>
           <w:szCs w:val="18"/>
         </w:rPr>
-        <w:t xml:space="preserve"/>
+        <w:t xml:space="preserve">
+        </w:t>
       </w:r>
     </w:p>
     <w:p>
@@ -13565,7 +13635,8 @@
           <w:sz w:val="18"/>
           <w:szCs w:val="18"/>
         </w:rPr>
-        <w:t xml:space="preserve"/>
+        <w:t xml:space="preserve">
+        </w:t>
       </w:r>
     </w:p>
     <w:p>
@@ -13610,7 +13681,8 @@
           <w:sz w:val="18"/>
           <w:szCs w:val="18"/>
         </w:rPr>
-        <w:t xml:space="preserve"/>
+        <w:t xml:space="preserve">
+        </w:t>
       </w:r>
     </w:p>
     <w:p>
@@ -13700,7 +13772,8 @@
           <w:sz w:val="18"/>
           <w:szCs w:val="18"/>
         </w:rPr>
-        <w:t xml:space="preserve"/>
+        <w:t xml:space="preserve">
+        </w:t>
       </w:r>
     </w:p>
     <w:p>
@@ -13753,7 +13826,8 @@
         <w:spacing w:after="60" w:before="0"/>
       </w:pPr>
       <w:r>
-        <w:t xml:space="preserve"/>
+        <w:t xml:space="preserve">
+        </w:t>
       </w:r>
     </w:p>
     <w:p>
@@ -13845,7 +13919,8 @@
           <w:sz w:val="18"/>
           <w:szCs w:val="18"/>
         </w:rPr>
-        <w:t xml:space="preserve"/>
+        <w:t xml:space="preserve">
+        </w:t>
       </w:r>
     </w:p>
     <w:p>
@@ -13905,7 +13980,8 @@
           <w:sz w:val="18"/>
           <w:szCs w:val="18"/>
         </w:rPr>
-        <w:t xml:space="preserve"/>
+        <w:t xml:space="preserve">
+        </w:t>
       </w:r>
     </w:p>
     <w:p>
@@ -13995,7 +14071,8 @@
           <w:sz w:val="18"/>
           <w:szCs w:val="18"/>
         </w:rPr>
-        <w:t xml:space="preserve"/>
+        <w:t xml:space="preserve">
+        </w:t>
       </w:r>
     </w:p>
     <w:p>
@@ -14033,7 +14110,8 @@
         <w:spacing w:after="60" w:before="0"/>
       </w:pPr>
       <w:r>
-        <w:t xml:space="preserve"/>
+        <w:t xml:space="preserve">
+        </w:t>
       </w:r>
     </w:p>
     <w:p>
@@ -14081,7 +14159,7 @@
           <w:sz w:val="22"/>
           <w:szCs w:val="22"/>
         </w:rPr>
-        <w:t xml:space="preserve">setup.sh runs on a fresh Pi OS Bookworm image and accepts a role argument (controller or sender). It installs GStreamer, configures UART, sets up NetworkManager wifi profiles, installs a systemd service, and configures time sync.</w:t>
+        <w:t xml:space="preserve">setup.sh runs on a fresh Pi OS Bookworm image and accepts a role argument (controller or sender). It installs GStreamer/libcamera/GL/KMS tools, configures UART, configures lab and flight wifi profiles, installs the appropriate systemd service, writes /etc/arc/*.toml, sets headless multi-user boot, and expects a reboot before operation.</w:t>
       </w:r>
     </w:p>
     <w:p>
@@ -14146,7 +14224,8 @@
         <w:spacing w:after="60" w:before="0"/>
       </w:pPr>
       <w:r>
-        <w:t xml:space="preserve"/>
+        <w:t xml:space="preserve">
+        </w:t>
       </w:r>
     </w:p>
     <w:p>
@@ -14991,7 +15070,8 @@
         <w:spacing w:after="60" w:before="0"/>
       </w:pPr>
       <w:r>
-        <w:t xml:space="preserve"/>
+        <w:t xml:space="preserve">
+        </w:t>
       </w:r>
     </w:p>
     <w:p>
@@ -15005,7 +15085,7 @@
           <w:sz w:val="22"/>
           <w:szCs w:val="22"/>
         </w:rPr>
-        <w:t xml:space="preserve">On the bench: all Pis prefer lab wifi (priority 10). Controller can SSH into all nodes. Flight AP is available but not used. In flight: lab wifi is absent; Senders join the flight AP (priority 8) hosted by the Controller (priority 5, lower so lab wifi wins when present).</w:t>
+        <w:t xml:space="preserve">On the bench: all Pis prefer lab wifi, with TRT-ARC-1 priority 50 and TRT-ARC-2 priority 40. These profiles are forced to 2.4 GHz (bg) so Zero 2 W nodes do not get stranded by band steering. In flight: lab wifi is absent; Senders join the 2.4 GHz flight AP hosted by the Controller.</w:t>
       </w:r>
     </w:p>
     <w:p>
@@ -15013,7 +15093,8 @@
         <w:spacing w:after="60" w:before="0"/>
       </w:pPr>
       <w:r>
-        <w:t xml:space="preserve"/>
+        <w:t xml:space="preserve">
+        </w:t>
       </w:r>
     </w:p>
     <w:p>
@@ -15095,7 +15176,8 @@
         <w:spacing w:after="60" w:before="0"/>
       </w:pPr>
       <w:r>
-        <w:t xml:space="preserve"/>
+        <w:t xml:space="preserve">
+        </w:t>
       </w:r>
     </w:p>
     <w:p>
@@ -15213,7 +15295,8 @@
         <w:spacing w:after="60" w:before="0"/>
       </w:pPr>
       <w:r>
-        <w:t xml:space="preserve"/>
+        <w:t xml:space="preserve">
+        </w:t>
       </w:r>
     </w:p>
     <w:p>
@@ -15287,7 +15370,7 @@
           <w:sz w:val="22"/>
           <w:szCs w:val="22"/>
         </w:rPr>
-        <w:t xml:space="preserve">End-to-end ack retry timeouts must account for full multi-hop round-trip: estimate 200–500ms worst case. Tune the timeout to 1–2 seconds to avoid spurious retries.</w:t>
+        <w:t xml:space="preserve">End-to-end ack retry timeouts must account for full multi-hop round-trip: estimate 200â€“500ms worst case. Tune the timeout to 1â€“2 seconds to avoid spurious retries.</w:t>
       </w:r>
     </w:p>
     <w:p>
@@ -15333,7 +15416,8 @@
         <w:spacing w:after="60" w:before="0"/>
       </w:pPr>
       <w:r>
-        <w:t xml:space="preserve"/>
+        <w:t xml:space="preserve">
+        </w:t>
       </w:r>
     </w:p>
     <w:p>
@@ -15369,7 +15453,7 @@
           <w:sz w:val="22"/>
           <w:szCs w:val="22"/>
         </w:rPr>
-        <w:t xml:space="preserve">sync=false everywhere on the receive path is critical. Without it, GStreamer buffers frames to match timestamps and adds 50–100ms of latency.</w:t>
+        <w:t xml:space="preserve">sync=false everywhere on the receive path is critical. Without it, GStreamer buffers frames to match timestamps and adds 50â€“100ms of latency.</w:t>
       </w:r>
     </w:p>
     <w:p>
@@ -15434,7 +15518,8 @@
         <w:spacing w:after="60" w:before="0"/>
       </w:pPr>
       <w:r>
-        <w:t xml:space="preserve"/>
+        <w:t xml:space="preserve">
+        </w:t>
       </w:r>
     </w:p>
     <w:p>
@@ -15508,7 +15593,7 @@
           <w:sz w:val="22"/>
           <w:szCs w:val="22"/>
         </w:rPr>
-        <w:t xml:space="preserve">Controller reboots in flight: Starts in default state (local-camera fullscreen, no remote source). Waits for FC-N to send the current desired state. Reconnects to Senders automatically.</w:t>
+        <w:t xml:space="preserve">Controller reboots in flight: Starts in the configured startup layout. Current bench default is split mode: local camera as the main view and the first configured Sender as PIP. If the Sender is not online yet, that PIP slot stays black until the Sender connects.</w:t>
       </w:r>
     </w:p>
     <w:p>
@@ -15535,7 +15620,8 @@
         <w:spacing w:after="60" w:before="0"/>
       </w:pPr>
       <w:r>
-        <w:t xml:space="preserve"/>
+        <w:t xml:space="preserve">
+        </w:t>
       </w:r>
     </w:p>
     <w:p>
@@ -15631,7 +15717,8 @@
         <w:spacing w:after="60" w:before="0"/>
       </w:pPr>
       <w:r>
-        <w:t xml:space="preserve"/>
+        <w:t xml:space="preserve">
+        </w:t>
       </w:r>
     </w:p>
     <w:tbl>
@@ -15691,7 +15778,8 @@
         <w:spacing w:after="60" w:before="0"/>
       </w:pPr>
       <w:r>
-        <w:t xml:space="preserve"/>
+        <w:t xml:space="preserve">
+        </w:t>
       </w:r>
     </w:p>
     <w:p>
@@ -15730,7 +15818,8 @@
         <w:spacing w:after="60" w:before="0"/>
       </w:pPr>
       <w:r>
-        <w:t xml:space="preserve"/>
+        <w:t xml:space="preserve">
+        </w:t>
       </w:r>
     </w:p>
     <w:tbl>
@@ -17000,7 +17089,8 @@
         <w:spacing w:after="60" w:before="0"/>
       </w:pPr>
       <w:r>
-        <w:t xml:space="preserve"/>
+        <w:t xml:space="preserve">
+        </w:t>
       </w:r>
     </w:p>
     <w:p>
@@ -18072,7 +18162,8 @@
         <w:spacing w:after="60" w:before="0"/>
       </w:pPr>
       <w:r>
-        <w:t xml:space="preserve"/>
+        <w:t xml:space="preserve">
+        </w:t>
       </w:r>
     </w:p>
     <w:p>
@@ -18097,7 +18188,85 @@
           <w:sz w:val="18"/>
           <w:szCs w:val="18"/>
         </w:rPr>
-        <w:t xml:space="preserve">End of Document — KD3BBP / TRT ARC Project</w:t>
+        <w:t xml:space="preserve">End of Document â€” KD3BBP / TRT ARC Project</w:t>
+      </w:r>
+    </w:p>
+    <w:p>
+      <w:pPr>
+        <w:pStyle w:val="Heading2"/>
+      </w:pPr>
+      <w:r>
+        <w:t xml:space="preserve">12.6 Bench-Validated Hardware Baseline (May 2026)</w:t>
+      </w:r>
+    </w:p>
+    <w:p>
+      <w:r>
+        <w:t xml:space="preserve">This section records the current working baseline validated on physical hardware. Where it differs from earlier design assumptions, this section wins.</w:t>
+      </w:r>
+    </w:p>
+    <w:p>
+      <w:r>
+        <w:t xml:space="preserve">Controller: Raspberry Pi 5. The Zero 2 W could produce composite video but was not fast enough for the real use case of local camera plus PIP/compositing.</w:t>
+      </w:r>
+    </w:p>
+    <w:p>
+      <w:r>
+        <w:t xml:space="preserve">Controller composite output: Pi 5 composite appears as DRM driver drm-rp1-vec, not the vc4 connector list. Validate with modetest -M drm-rp1-vec -c. The working sink is kmssink driver-name=drm-rp1-vec sync=false.</w:t>
+      </w:r>
+    </w:p>
+    <w:p>
+      <w:r>
+        <w:t xml:space="preserve">Controller boot config: enable_tvout=1, dtoverlay=vc4-kms-v3d-pi5,composite, display_auto_detect=0, plus cmdline entries vc4.tv_norm=NTSC and video=Composite-1:720x480i,tv_mode=NTSC.</w:t>
+      </w:r>
+    </w:p>
+    <w:p>
+      <w:r>
+        <w:t xml:space="preserve">Controller compositor: glvideomixer renders a 720x480 output with a black background, local camera centered at 640x480, callsign textoverlay, and default PIP at 240x160 positioned at x=420 y=280.</w:t>
+      </w:r>
+    </w:p>
+    <w:p>
+      <w:r>
+        <w:t xml:space="preserve">Controller camera path: use libcamerasrc ! videoconvert ! video/x-raw,width=640,height=480,format=I420,framerate=30/1 before GL upload. Putting queues/caps in the wrong order allowed raw 1536x864 Bayer negotiation and produced broken or laggy output.</w:t>
+      </w:r>
+    </w:p>
+    <w:p>
+      <w:r>
+        <w:t xml:space="preserve">Remote receive path: udpsrc port=50XX with RTP H.264 caps including clock-rate=90000, rtpjitterbuffer latency=100 drop-on-latency=true, rtph264depay, h264parse, avdec_h264, videoconvert, I420 caps, then a small downstream-leaky queue and GL upload.</w:t>
+      </w:r>
+    </w:p>
+    <w:p>
+      <w:r>
+        <w:t xml:space="preserve">Do not drop compressed H.264 packets before depay/parse/decode unless intentionally accepting corruption. Early leaky queues caused green/corrupt PIP. Drop late frames after decode/raw conversion instead.</w:t>
+      </w:r>
+    </w:p>
+    <w:p>
+      <w:r>
+        <w:t xml:space="preserve">Sender: Raspberry Pi Zero 2 W works as a camera sender, but the current tested Pi OS kernel fails v4l2h264enc/bcm2835-codec with bcm2835_codec_start_streaming ret -3. The setup default is software x264enc at 640x480@15fps and about 1.2 Mbps.</w:t>
+      </w:r>
+    </w:p>
+    <w:p>
+      <w:r>
+        <w:t xml:space="preserve">Startup: setup installs and enables arc-controller or arc-sender but does not start the service immediately. Reboot after setup. Both roles boot to multi-user.target to keep the desktop, PipeWire, and other display/camera consumers out of the way.</w:t>
+      </w:r>
+    </w:p>
+    <w:p>
+      <w:r>
+        <w:t xml:space="preserve">Default operation after reboot: the controller starts in split layout, shows its local camera as main, shows black in the remote PIP until the first configured Sender connects, then commands that Sender to stream. Senders start streaming on boot.</w:t>
+      </w:r>
+    </w:p>
+    <w:p>
+      <w:r>
+        <w:t xml:space="preserve">Wifi: lab SSIDs are forced to 2.4 GHz with TRT-ARC-1 preferred over TRT-ARC-2. This keeps Zero 2 W senders connected and also keeps the Pi 5 controller on the 2.4 GHz copy of the ARC lab SSID. The setting is per NetworkManager profile, not a global radio disable. Pixel hotspot band steering was unreliable for Zero 2 W; use a dedicated 2.4 GHz lab AP or the Controller flight AP when possible.</w:t>
+      </w:r>
+    </w:p>
+    <w:p>
+      <w:r>
+        <w:t xml:space="preserve">Power: sender undervoltage caused misleading video/network failures. Check vcgencmd get_throttled; the desired value is 0x0.</w:t>
+      </w:r>
+    </w:p>
+    <w:p>
+      <w:r>
+        <w:t xml:space="preserve">Useful diagnostics: journalctl -u arc-controller -f, journalctl -u arc-sender -f, tcpdump -ni any udp port 5012, v4l2-ctl --list-devices, modetest -M drm-rp1-vec -c.</w:t>
       </w:r>
     </w:p>
     <w:sectPr>
@@ -18112,11 +18281,7 @@
 </w:document>
 </file>
 
-<file path=word/comments.xml><?xml version="1.0" encoding="utf-8"?>
-<w:comments xmlns:cx="http://schemas.microsoft.com/office/drawing/2014/chartex" xmlns:cx1="http://schemas.microsoft.com/office/drawing/2015/9/8/chartex" xmlns:cx2="http://schemas.microsoft.com/office/drawing/2015/10/21/chartex" xmlns:cx3="http://schemas.microsoft.com/office/drawing/2016/5/9/chartex" xmlns:cx4="http://schemas.microsoft.com/office/drawing/2016/5/10/chartex" xmlns:cx5="http://schemas.microsoft.com/office/drawing/2016/5/11/chartex" xmlns:cx6="http://schemas.microsoft.com/office/drawing/2016/5/12/chartex" xmlns:cx7="http://schemas.microsoft.com/office/drawing/2016/5/13/chartex" xmlns:cx8="http://schemas.microsoft.com/office/drawing/2016/5/14/chartex" xmlns:mc="http://schemas.openxmlformats.org/markup-compatibility/2006" xmlns:aink="http://schemas.microsoft.com/office/drawing/2016/ink" xmlns:am3d="http://schemas.microsoft.com/office/drawing/2017/model3d" xmlns:o="urn:schemas-microsoft-com:office:office" xmlns:r="http://schemas.openxmlformats.org/officeDocument/2006/relationships" xmlns:m="http://schemas.openxmlformats.org/officeDocument/2006/math" xmlns:v="urn:schemas-microsoft-com:vml" xmlns:wp14="http://schemas.microsoft.com/office/word/2010/wordprocessingDrawing" xmlns:wp="http://schemas.openxmlformats.org/drawingml/2006/wordprocessingDrawing" xmlns:w10="urn:schemas-microsoft-com:office:word" xmlns:w="http://schemas.openxmlformats.org/wordprocessingml/2006/main" xmlns:w14="http://schemas.microsoft.com/office/word/2010/wordml" xmlns:w15="http://schemas.microsoft.com/office/word/2012/wordml" xmlns:w16cex="http://schemas.microsoft.com/office/word/2018/wordml/cex" xmlns:w16cid="http://schemas.microsoft.com/office/word/2016/wordml/cid" xmlns:w16="http://schemas.microsoft.com/office/word/2018/wordml" xmlns:w16sdtdh="http://schemas.microsoft.com/office/word/2020/wordml/sdtdatahash" xmlns:w16se="http://schemas.microsoft.com/office/word/2015/wordml/symex" xmlns:wpg="http://schemas.microsoft.com/office/word/2010/wordprocessingGroup" xmlns:wpi="http://schemas.microsoft.com/office/word/2010/wordprocessingInk" xmlns:wne="http://schemas.microsoft.com/office/word/2006/wordml" xmlns:wps="http://schemas.microsoft.com/office/word/2010/wordprocessingShape"/>
-</file>
-
-<file path=word/endnotes.xml><?xml version="1.0" encoding="utf-8"?>
+<file path=word\endnotes.xml><?xml version="1.0" encoding="utf-8"?>
 <w:endnotes xmlns:wpc="http://schemas.microsoft.com/office/word/2010/wordprocessingCanvas" xmlns:mc="http://schemas.openxmlformats.org/markup-compatibility/2006" xmlns:o="urn:schemas-microsoft-com:office:office" xmlns:r="http://schemas.openxmlformats.org/officeDocument/2006/relationships" xmlns:m="http://schemas.openxmlformats.org/officeDocument/2006/math" xmlns:v="urn:schemas-microsoft-com:vml" xmlns:wp14="http://schemas.microsoft.com/office/word/2010/wordprocessingDrawing" xmlns:wp="http://schemas.openxmlformats.org/drawingml/2006/wordprocessingDrawing" xmlns:w10="urn:schemas-microsoft-com:office:word" xmlns:w="http://schemas.openxmlformats.org/wordprocessingml/2006/main" xmlns:w14="http://schemas.microsoft.com/office/word/2010/wordml" xmlns:w15="http://schemas.microsoft.com/office/word/2012/wordml" xmlns:wpg="http://schemas.microsoft.com/office/word/2010/wordprocessingGroup" xmlns:wpi="http://schemas.microsoft.com/office/word/2010/wordprocessingInk" xmlns:wne="http://schemas.microsoft.com/office/word/2006/wordml" xmlns:wps="http://schemas.microsoft.com/office/word/2010/wordprocessingShape" mc:Ignorable="w14 w15 wp14">
   <w:endnote w:type="separator" w:id="-1">
     <w:p>
@@ -18153,7 +18318,11 @@
 </w:endnotes>
 </file>
 
-<file path=word/footer1.xml><?xml version="1.0" encoding="utf-8"?>
+<file path=word\fontTable.xml><?xml version="1.0" encoding="utf-8"?>
+<w:fonts xmlns:mc="http://schemas.openxmlformats.org/markup-compatibility/2006" xmlns:r="http://schemas.openxmlformats.org/officeDocument/2006/relationships" xmlns:w="http://schemas.openxmlformats.org/wordprocessingml/2006/main" xmlns:w14="http://schemas.microsoft.com/office/word/2010/wordml" xmlns:w15="http://schemas.microsoft.com/office/word/2012/wordml" xmlns:w16cex="http://schemas.microsoft.com/office/word/2018/wordml/cex" xmlns:w16cid="http://schemas.microsoft.com/office/word/2016/wordml/cid" xmlns:w16="http://schemas.microsoft.com/office/word/2018/wordml" xmlns:w16sdtdh="http://schemas.microsoft.com/office/word/2020/wordml/sdtdatahash" xmlns:w16se="http://schemas.microsoft.com/office/word/2015/wordml/symex" mc:Ignorable="w14 w15 w16se w16cid w16 w16cex w16sdtdh"/>
+</file>
+
+<file path=word\footer1.xml><?xml version="1.0" encoding="utf-8"?>
 <w:ftr xmlns:wpc="http://schemas.microsoft.com/office/word/2010/wordprocessingCanvas" xmlns:mc="http://schemas.openxmlformats.org/markup-compatibility/2006" xmlns:o="urn:schemas-microsoft-com:office:office" xmlns:r="http://schemas.openxmlformats.org/officeDocument/2006/relationships" xmlns:m="http://schemas.openxmlformats.org/officeDocument/2006/math" xmlns:v="urn:schemas-microsoft-com:vml" xmlns:wp14="http://schemas.microsoft.com/office/word/2010/wordprocessingDrawing" xmlns:wp="http://schemas.openxmlformats.org/drawingml/2006/wordprocessingDrawing" xmlns:w10="urn:schemas-microsoft-com:office:word" xmlns:w="http://schemas.openxmlformats.org/wordprocessingml/2006/main" xmlns:w14="http://schemas.microsoft.com/office/word/2010/wordml" xmlns:w15="http://schemas.microsoft.com/office/word/2012/wordml" xmlns:wpg="http://schemas.microsoft.com/office/word/2010/wordprocessingGroup" xmlns:wpi="http://schemas.microsoft.com/office/word/2010/wordprocessingInk" xmlns:wne="http://schemas.microsoft.com/office/word/2006/wordml" xmlns:wps="http://schemas.microsoft.com/office/word/2010/wordprocessingShape">
   <w:p>
     <w:pPr>
@@ -18190,7 +18359,7 @@
 </w:ftr>
 </file>
 
-<file path=word/footnotes.xml><?xml version="1.0" encoding="utf-8"?>
+<file path=word\footnotes.xml><?xml version="1.0" encoding="utf-8"?>
 <w:footnotes xmlns:wpc="http://schemas.microsoft.com/office/word/2010/wordprocessingCanvas" xmlns:mc="http://schemas.openxmlformats.org/markup-compatibility/2006" xmlns:o="urn:schemas-microsoft-com:office:office" xmlns:r="http://schemas.openxmlformats.org/officeDocument/2006/relationships" xmlns:m="http://schemas.openxmlformats.org/officeDocument/2006/math" xmlns:v="urn:schemas-microsoft-com:vml" xmlns:wp14="http://schemas.microsoft.com/office/word/2010/wordprocessingDrawing" xmlns:wp="http://schemas.openxmlformats.org/drawingml/2006/wordprocessingDrawing" xmlns:w10="urn:schemas-microsoft-com:office:word" xmlns:w="http://schemas.openxmlformats.org/wordprocessingml/2006/main" xmlns:w14="http://schemas.microsoft.com/office/word/2010/wordml" xmlns:w15="http://schemas.microsoft.com/office/word/2012/wordml" xmlns:wpg="http://schemas.microsoft.com/office/word/2010/wordprocessingGroup" xmlns:wpi="http://schemas.microsoft.com/office/word/2010/wordprocessingInk" xmlns:wne="http://schemas.microsoft.com/office/word/2006/wordml" xmlns:wps="http://schemas.microsoft.com/office/word/2010/wordprocessingShape" mc:Ignorable="w14 w15 wp14">
   <w:footnote w:type="separator" w:id="-1">
     <w:p>
@@ -18227,7 +18396,7 @@
 </w:footnotes>
 </file>
 
-<file path=word/header1.xml><?xml version="1.0" encoding="utf-8"?>
+<file path=word\header1.xml><?xml version="1.0" encoding="utf-8"?>
 <w:hdr xmlns:wpc="http://schemas.microsoft.com/office/word/2010/wordprocessingCanvas" xmlns:mc="http://schemas.openxmlformats.org/markup-compatibility/2006" xmlns:o="urn:schemas-microsoft-com:office:office" xmlns:r="http://schemas.openxmlformats.org/officeDocument/2006/relationships" xmlns:m="http://schemas.openxmlformats.org/officeDocument/2006/math" xmlns:v="urn:schemas-microsoft-com:vml" xmlns:wp14="http://schemas.microsoft.com/office/word/2010/wordprocessingDrawing" xmlns:wp="http://schemas.openxmlformats.org/drawingml/2006/wordprocessingDrawing" xmlns:w10="urn:schemas-microsoft-com:office:word" xmlns:w="http://schemas.openxmlformats.org/wordprocessingml/2006/main" xmlns:w14="http://schemas.microsoft.com/office/word/2010/wordml" xmlns:w15="http://schemas.microsoft.com/office/word/2012/wordml" xmlns:wpg="http://schemas.microsoft.com/office/word/2010/wordprocessingGroup" xmlns:wpi="http://schemas.microsoft.com/office/word/2010/wordprocessingInk" xmlns:wne="http://schemas.microsoft.com/office/word/2006/wordml" xmlns:wps="http://schemas.microsoft.com/office/word/2010/wordprocessingShape" xmlns:cx="http://schemas.microsoft.com/office/drawing/2014/chartex" xmlns:cx1="http://schemas.microsoft.com/office/drawing/2015/9/8/chartex" xmlns:cx2="http://schemas.microsoft.com/office/drawing/2015/10/21/chartex" xmlns:cx3="http://schemas.microsoft.com/office/drawing/2016/5/9/chartex" xmlns:cx4="http://schemas.microsoft.com/office/drawing/2016/5/10/chartex" xmlns:cx5="http://schemas.microsoft.com/office/drawing/2016/5/11/chartex" xmlns:cx6="http://schemas.microsoft.com/office/drawing/2016/5/12/chartex" xmlns:cx7="http://schemas.microsoft.com/office/drawing/2016/5/13/chartex" xmlns:cx8="http://schemas.microsoft.com/office/drawing/2016/5/14/chartex" xmlns:w16cid="http://schemas.microsoft.com/office/word/2016/wordml/cid" xmlns:w16se="http://schemas.microsoft.com/office/word/2015/wordml/symex">
   <w:p>
     <w:pPr>
@@ -18260,7 +18429,7 @@
 </w:hdr>
 </file>
 
-<file path=word/numbering.xml><?xml version="1.0" encoding="utf-8"?>
+<file path=word\numbering.xml><?xml version="1.0" encoding="utf-8"?>
 <w:numbering xmlns:wpc="http://schemas.microsoft.com/office/word/2010/wordprocessingCanvas" xmlns:mc="http://schemas.openxmlformats.org/markup-compatibility/2006" xmlns:o="urn:schemas-microsoft-com:office:office" xmlns:r="http://schemas.openxmlformats.org/officeDocument/2006/relationships" xmlns:m="http://schemas.openxmlformats.org/officeDocument/2006/math" xmlns:v="urn:schemas-microsoft-com:vml" xmlns:wp14="http://schemas.microsoft.com/office/word/2010/wordprocessingDrawing" xmlns:wp="http://schemas.openxmlformats.org/drawingml/2006/wordprocessingDrawing" xmlns:w10="urn:schemas-microsoft-com:office:word" xmlns:w="http://schemas.openxmlformats.org/wordprocessingml/2006/main" xmlns:w14="http://schemas.microsoft.com/office/word/2010/wordml" xmlns:w15="http://schemas.microsoft.com/office/word/2012/wordml" xmlns:wpg="http://schemas.microsoft.com/office/word/2010/wordprocessingGroup" xmlns:wpi="http://schemas.microsoft.com/office/word/2010/wordprocessingInk" xmlns:wne="http://schemas.microsoft.com/office/word/2006/wordml" xmlns:wps="http://schemas.microsoft.com/office/word/2010/wordprocessingShape" mc:Ignorable="w14 w15 wp14">
   <w:abstractNum w:abstractNumId="1" w15:restartNumberingAfterBreak="0">
     <w:multiLevelType w:val="hybridMultilevel"/>
@@ -18400,7 +18569,17 @@
 </w:numbering>
 </file>
 
-<file path=word/styles.xml><?xml version="1.0" encoding="utf-8"?>
+<file path=word\settings.xml><?xml version="1.0" encoding="utf-8"?>
+<w:settings xmlns:wpc="http://schemas.microsoft.com/office/word/2010/wordprocessingCanvas" xmlns:mc="http://schemas.openxmlformats.org/markup-compatibility/2006" xmlns:o="urn:schemas-microsoft-com:office:office" xmlns:r="http://schemas.openxmlformats.org/officeDocument/2006/relationships" xmlns:m="http://schemas.openxmlformats.org/officeDocument/2006/math" xmlns:v="urn:schemas-microsoft-com:vml" xmlns:wp14="http://schemas.microsoft.com/office/word/2010/wordprocessingDrawing" xmlns:wp="http://schemas.openxmlformats.org/drawingml/2006/wordprocessingDrawing" xmlns:w10="urn:schemas-microsoft-com:office:word" xmlns:w="http://schemas.openxmlformats.org/wordprocessingml/2006/main" xmlns:w14="http://schemas.microsoft.com/office/word/2010/wordml" xmlns:w15="http://schemas.microsoft.com/office/word/2012/wordml" xmlns:wpg="http://schemas.microsoft.com/office/word/2010/wordprocessingGroup" xmlns:wpi="http://schemas.microsoft.com/office/word/2010/wordprocessingInk" xmlns:wne="http://schemas.microsoft.com/office/word/2006/wordml" xmlns:wps="http://schemas.microsoft.com/office/word/2010/wordprocessingShape" mc:Ignorable="w14 w15 wp14">
+  <w:displayBackgroundShape/>
+  <w:evenAndOddHeaders w:val="false"/>
+  <w:compat>
+    <w:compatSetting w:val="15" w:name="compatibilityMode" w:uri="http://schemas.microsoft.com/office/word"/>
+  </w:compat>
+</w:settings>
+</file>
+
+<file path=word\styles.xml><?xml version="1.0" encoding="utf-8"?>
 <w:styles xmlns:mc="http://schemas.openxmlformats.org/markup-compatibility/2006" xmlns:r="http://schemas.openxmlformats.org/officeDocument/2006/relationships" xmlns:w="http://schemas.openxmlformats.org/wordprocessingml/2006/main" xmlns:w14="http://schemas.microsoft.com/office/word/2010/wordml" xmlns:w15="http://schemas.microsoft.com/office/word/2012/wordml" mc:Ignorable="w14 w15">
   <w:docDefaults>
     <w:rPrDefault>

</xml_diff>

<commit_message>
Add bench command server and CLI for local video source control
- Implemented BenchCommandServer to handle localhost-only commands for testing video sources without an FC.
- Added commands for status, layout, source, cycle, and stop-cycle to the BenchCommandServer.
- Created a new CLI tool (controller_cli.py) to interact with the BenchCommandServer.
- Updated README.md with usage instructions for the new CLI and bench controls.
- Modified setup.sh to include a --force-config option for regenerating configuration files.
- Added unit tests for the BenchCommandServer to verify source and layout commands.
</commit_message>
<xml_diff>
--- a/ARC_Systems_Design.docx
+++ b/ARC_Systems_Design.docx
@@ -18267,6 +18267,11 @@
     <w:p>
       <w:r>
         <w:t xml:space="preserve">Useful diagnostics: journalctl -u arc-controller -f, journalctl -u arc-sender -f, tcpdump -ni any udp port 5012, v4l2-ctl --list-devices, modetest -M drm-rp1-vec -c.</w:t>
+      </w:r>
+    </w:p>
+    <w:p>
+      <w:r>
+        <w:t xml:space="preserve">Bench source switching without an FC: while arc-controller is running, SSH to arcpi1 and run python -m arc.controller_cli status, python -m arc.controller_cli source 1 sender-c, python -m arc.controller_cli source 1 sender-l1, or python -m arc.controller_cli cycle 1 5 sender-c sender-l1. The bench command socket is localhost-only on 127.0.0.1:6010 and is separate from the flight FC protocol.</w:t>
       </w:r>
     </w:p>
     <w:sectPr>

</xml_diff>

<commit_message>
Add support for selector switch mode in video pipeline
- Introduced a new configuration option `switch_mode` in the video settings, allowing users to choose between "rebuild" and "selector" modes.
- Updated the pipeline controller to handle the new selector mode, which enables smoother source switching by using input selectors instead of rebuilding the GStreamer graph.
- Modified the README to document the new switch mode and its implications for performance and configuration.
- Enhanced unit tests to cover the new switch mode functionality, ensuring that the pipeline behaves correctly under both modes.
</commit_message>
<xml_diff>
--- a/ARC_Systems_Design.docx
+++ b/ARC_Systems_Design.docx
@@ -18221,7 +18221,7 @@
     </w:p>
     <w:p>
       <w:r>
-        <w:t xml:space="preserve">Controller compositor: glvideomixer renders a 720x480 output with a black background, local camera centered at 640x480, callsign textoverlay, and default PIP at 240x160 positioned at x=420 y=280.</w:t>
+        <w:t xml:space="preserve">Controller compositor: glvideomixer renders a 720x480 output with a black background, local camera centered at 640x480, callsign textoverlay, and default PIP at 240x160 positioned at x=420 y=280. Current controller config uses switch_mode=selector, wiring slot input-selectors into the running graph so source changes flip active pads instead of restarting KMS/compositor output.</w:t>
       </w:r>
     </w:p>
     <w:p>
@@ -18271,7 +18271,7 @@
     </w:p>
     <w:p>
       <w:r>
-        <w:t xml:space="preserve">Bench source switching without an FC: while arc-controller is running, SSH to arcpi1 and run python -m arc.controller_cli status, python -m arc.controller_cli source 1 sender-c, python -m arc.controller_cli source 1 sender-l1, python -m arc.controller_cli cycle 1 5 sender-c sender-l1, or python -m arc.controller_cli rotate 5 local sender-c sender-l1. The rotate command advances the listed pictures through main, offscreen/rest, and PIP. The bench command socket is localhost-only on 127.0.0.1:6010 and is separate from the flight FC protocol.</w:t>
+        <w:t xml:space="preserve">Bench source switching without an FC: while arc-controller is running, SSH to arcpi1 and run python -m arc.controller_cli status, python -m arc.controller_cli source 1 sender-c, python -m arc.controller_cli source 1 sender-l1, python -m arc.controller_cli cycle 1 5 sender-c sender-l1, or python -m arc.controller_cli rotate 5 local sender-c sender-l1. The rotate command advances the listed pictures through main, offscreen/rest, and PIP. With switch_mode=selector, these commands should not rebuild the KMS/compositor pipeline; they switch active input-selector pads. The bench command socket is localhost-only on 127.0.0.1:6010 and is separate from the flight FC protocol.</w:t>
       </w:r>
     </w:p>
     <w:sectPr>

</xml_diff>